<commit_message>
Update brand colors and documentation accuracy
Add npm scripts for brand token verification and document generation. Update brand color hex values in documentation, clarify the distinction between the primary JS-defined pink and the CSS primary variable, and correct the computed hex for purple and section-alt swatches.

Replit-Commit-Author: Agent
Replit-Commit-Session-Id: 1306ee59-bff6-40fa-84d5-ab4d42c9c06f
Replit-Commit-Checkpoint-Type: full_checkpoint
Replit-Commit-Event-Id: 7c115955-cbfb-4f73-b444-2905df2d89e7
Replit-Commit-Screenshot-Url: https://storage.googleapis.com/screenshot-production-us-central1/90cb4270-978f-4d4e-b806-f5770ce19ddc/1306ee59-bff6-40fa-84d5-ab4d42c9c06f/UR73XCZ
Replit-Helium-Checkpoint-Created: true
</commit_message>
<xml_diff>
--- a/brand-identity/VerionAI-Brand-Identity.docx
+++ b/brand-identity/VerionAI-Brand-Identity.docx
@@ -90,7 +90,7 @@
           <w:rFonts w:ascii="Calibri" w:cs="Calibri" w:eastAsia="Calibri" w:hAnsi="Calibri"/>
           <w:b/>
           <w:bCs/>
-          <w:color w:val="7C3AED"/>
+          <w:color w:val="732DEB"/>
           <w:spacing w:val="150"/>
           <w:sz w:val="16"/>
           <w:szCs w:val="16"/>
@@ -169,7 +169,7 @@
           <w:rFonts w:ascii="Calibri" w:cs="Calibri" w:eastAsia="Calibri" w:hAnsi="Calibri"/>
           <w:b/>
           <w:bCs/>
-          <w:color w:val="7C3AED"/>
+          <w:color w:val="732DEB"/>
           <w:spacing w:val="150"/>
           <w:sz w:val="16"/>
           <w:szCs w:val="16"/>
@@ -963,7 +963,7 @@
           <w:rFonts w:ascii="Calibri" w:cs="Calibri" w:eastAsia="Calibri" w:hAnsi="Calibri"/>
           <w:b/>
           <w:bCs/>
-          <w:color w:val="7C3AED"/>
+          <w:color w:val="732DEB"/>
           <w:spacing w:val="150"/>
           <w:sz w:val="16"/>
           <w:szCs w:val="16"/>
@@ -1002,6 +1002,22 @@
           <w:szCs w:val="20"/>
         </w:rPr>
         <w:t xml:space="preserve">All values extracted and verified from index.css custom properties and page-level JS constants.</w:t>
+      </w:r>
+    </w:p>
+    <w:p>
+      <w:pPr>
+        <w:spacing w:after="60" w:before="60"/>
+      </w:pPr>
+      <w:r>
+        <w:rPr>
+          <w:rFonts w:ascii="Calibri" w:cs="Calibri" w:eastAsia="Calibri" w:hAnsi="Calibri"/>
+          <w:b w:val="false"/>
+          <w:bCs w:val="false"/>
+          <w:color w:val="92400E"/>
+          <w:sz w:val="20"/>
+          <w:szCs w:val="20"/>
+        </w:rPr>
+        <w:t xml:space="preserve">NOTE — Two pink values exist in the codebase. The authoritative brand pink is the JS inline constant #D4196A (used in all custom-built branded elements: logo, CTAs, emphasis). A separate CSS variable --primary: hsl(328 82% 52%) = #E9208B exists for the Shadcn UI component system only — it is NOT the visual brand pink and should not be used in new branded assets.</w:t>
       </w:r>
     </w:p>
     <w:p>
@@ -1212,7 +1228,7 @@
                 <w:sz w:val="17"/>
                 <w:szCs w:val="17"/>
               </w:rPr>
-              <w:t xml:space="preserve">#D4196A  (--primary: hsl 328 82% 52%)</w:t>
+              <w:t xml:space="preserve">JS const: #D4196A  (authoritative brand pink — see note below)</w:t>
             </w:r>
           </w:p>
         </w:tc>
@@ -1253,7 +1269,7 @@
               <w:bottom w:val="single" w:color="E5E7EB" w:sz="4"/>
               <w:right w:val="single" w:color="E5E7EB" w:sz="4"/>
             </w:tcBorders>
-            <w:shd w:fill="7C3AED" w:color="7C3AED" w:val="solid"/>
+            <w:shd w:fill="732DEB" w:color="732DEB" w:val="solid"/>
           </w:tcPr>
           <w:p/>
         </w:tc>
@@ -1307,7 +1323,7 @@
                 <w:sz w:val="17"/>
                 <w:szCs w:val="17"/>
               </w:rPr>
-              <w:t xml:space="preserve">hsl(262 83% 55%)  (--accent: 262 83% 58%)</w:t>
+              <w:t xml:space="preserve">JS const: hsl(262 83% 55%) = #732DEB (exact)</w:t>
             </w:r>
           </w:p>
         </w:tc>
@@ -1823,7 +1839,7 @@
               <w:bottom w:val="single" w:color="E5E7EB" w:sz="4"/>
               <w:right w:val="single" w:color="E5E7EB" w:sz="4"/>
             </w:tcBorders>
-            <w:shd w:fill="F5F6F8" w:color="F5F6F8" w:val="solid"/>
+            <w:shd w:fill="F6F7F8" w:color="F6F7F8" w:val="solid"/>
           </w:tcPr>
           <w:p/>
         </w:tc>
@@ -1877,7 +1893,7 @@
                 <w:sz w:val="17"/>
                 <w:szCs w:val="17"/>
               </w:rPr>
-              <w:t xml:space="preserve">.section-alt: hsl(220 14% 97%)</w:t>
+              <w:t xml:space="preserve">.section-alt: hsl(220 14% 97%) = #F6F7F8 (exact)</w:t>
             </w:r>
           </w:p>
         </w:tc>
@@ -2212,7 +2228,7 @@
           <w:rFonts w:ascii="Calibri" w:cs="Calibri" w:eastAsia="Calibri" w:hAnsi="Calibri"/>
           <w:b/>
           <w:bCs/>
-          <w:color w:val="7C3AED"/>
+          <w:color w:val="732DEB"/>
           <w:spacing w:val="150"/>
           <w:sz w:val="16"/>
           <w:szCs w:val="16"/>
@@ -4649,7 +4665,7 @@
           <w:rFonts w:ascii="Calibri" w:cs="Calibri" w:eastAsia="Calibri" w:hAnsi="Calibri"/>
           <w:b/>
           <w:bCs/>
-          <w:color w:val="7C3AED"/>
+          <w:color w:val="732DEB"/>
           <w:spacing w:val="150"/>
           <w:sz w:val="16"/>
           <w:szCs w:val="16"/>
@@ -5299,7 +5315,7 @@
           <w:rFonts w:ascii="Calibri" w:cs="Calibri" w:eastAsia="Calibri" w:hAnsi="Calibri"/>
           <w:b/>
           <w:bCs/>
-          <w:color w:val="7C3AED"/>
+          <w:color w:val="732DEB"/>
           <w:spacing w:val="150"/>
           <w:sz w:val="16"/>
           <w:szCs w:val="16"/>
@@ -6040,7 +6056,7 @@
           <w:rFonts w:ascii="Calibri" w:cs="Calibri" w:eastAsia="Calibri" w:hAnsi="Calibri"/>
           <w:b/>
           <w:bCs/>
-          <w:color w:val="7C3AED"/>
+          <w:color w:val="732DEB"/>
           <w:spacing w:val="150"/>
           <w:sz w:val="16"/>
           <w:szCs w:val="16"/>
@@ -7087,7 +7103,7 @@
           <w:rFonts w:ascii="Calibri" w:cs="Calibri" w:eastAsia="Calibri" w:hAnsi="Calibri"/>
           <w:b/>
           <w:bCs/>
-          <w:color w:val="7C3AED"/>
+          <w:color w:val="732DEB"/>
           <w:spacing w:val="150"/>
           <w:sz w:val="16"/>
           <w:szCs w:val="16"/>
@@ -8370,7 +8386,7 @@
           <w:rFonts w:ascii="Calibri" w:cs="Calibri" w:eastAsia="Calibri" w:hAnsi="Calibri"/>
           <w:b/>
           <w:bCs/>
-          <w:color w:val="7C3AED"/>
+          <w:color w:val="732DEB"/>
           <w:spacing w:val="150"/>
           <w:sz w:val="16"/>
           <w:szCs w:val="16"/>
@@ -9081,7 +9097,7 @@
           <w:rFonts w:ascii="Calibri" w:cs="Calibri" w:eastAsia="Calibri" w:hAnsi="Calibri"/>
           <w:b/>
           <w:bCs/>
-          <w:color w:val="7C3AED"/>
+          <w:color w:val="732DEB"/>
           <w:spacing w:val="150"/>
           <w:sz w:val="16"/>
           <w:szCs w:val="16"/>
@@ -9305,7 +9321,7 @@
           <w:rFonts w:ascii="Calibri" w:cs="Calibri" w:eastAsia="Calibri" w:hAnsi="Calibri"/>
           <w:b/>
           <w:bCs/>
-          <w:color w:val="7C3AED"/>
+          <w:color w:val="732DEB"/>
           <w:spacing w:val="150"/>
           <w:sz w:val="16"/>
           <w:szCs w:val="16"/>

</xml_diff>